<commit_message>
lee a kyi gyi
</commit_message>
<xml_diff>
--- a/(Ai fixed) SBS24010097_PhoneMyatMin_DataStructuresAndAlgorithms_FinalAssignment.docx
+++ b/(Ai fixed) SBS24010097_PhoneMyatMin_DataStructuresAndAlgorithms_FinalAssignment.docx
@@ -7907,7 +7907,7 @@
           </w:tcPr>
           <w:p>
             <w:r>
-              <w:t>Goods object</w:t>
+              <w:t>N/A</w:t>
             </w:r>
           </w:p>
         </w:tc>
@@ -7917,7 +7917,7 @@
           </w:tcPr>
           <w:p>
             <w:r>
-              <w:t xml:space="preserve">Pre: weight &gt;= 0. Post: Valid Goods object created in memory with all fields initialized. Axiom: if weight &lt; 0, throw </w:t>
+              <w:t xml:space="preserve">Post: Valid Goods object created in memory. Axiom: Exceptions are evaluated in order: Name first, then Weight. If name is empty, throws </w:t>
             </w:r>
             <w:proofErr w:type="spellStart"/>
             <w:r>
@@ -7925,7 +7925,15 @@
             </w:r>
             <w:proofErr w:type="spellEnd"/>
             <w:r>
-              <w:t xml:space="preserve"> exception.</w:t>
+              <w:t xml:space="preserve">. If weight &lt; 0, throws </w:t>
+            </w:r>
+            <w:proofErr w:type="spellStart"/>
+            <w:r>
+              <w:t>invalid_argument</w:t>
+            </w:r>
+            <w:proofErr w:type="spellEnd"/>
+            <w:r>
+              <w:t>.</w:t>
             </w:r>
           </w:p>
         </w:tc>
@@ -8061,11 +8069,14 @@
             </w:r>
             <w:proofErr w:type="spellEnd"/>
             <w:r>
-              <w:t xml:space="preserve"> is empty, throw </w:t>
+              <w:t xml:space="preserve"> is empty, </w:t>
+            </w:r>
+            <w:r>
+              <w:lastRenderedPageBreak/>
+              <w:t xml:space="preserve">throw </w:t>
             </w:r>
             <w:proofErr w:type="spellStart"/>
             <w:r>
-              <w:lastRenderedPageBreak/>
               <w:t>invalid_argument</w:t>
             </w:r>
             <w:proofErr w:type="spellEnd"/>
@@ -8420,86 +8431,89 @@
           <w:rFonts w:ascii="Consolas" w:hAnsi="Consolas"/>
           <w:sz w:val="18"/>
         </w:rPr>
-        <w:t>class Goods {</w:t>
-      </w:r>
+        <w:t xml:space="preserve">    </w:t>
+      </w:r>
+      <w:proofErr w:type="gramStart"/>
       <w:r>
         <w:rPr>
           <w:rFonts w:ascii="Consolas" w:hAnsi="Consolas"/>
           <w:sz w:val="18"/>
         </w:rPr>
-        <w:br/>
-        <w:t>private:</w:t>
-      </w:r>
+        <w:t>Goods(</w:t>
+      </w:r>
+      <w:proofErr w:type="gramEnd"/>
       <w:r>
         <w:rPr>
           <w:rFonts w:ascii="Consolas" w:hAnsi="Consolas"/>
           <w:sz w:val="18"/>
         </w:rPr>
-        <w:br/>
-        <w:t xml:space="preserve">    string name;    // Private - Information Hiding</w:t>
-      </w:r>
-      <w:r>
+        <w:t>string name = "Unnamed", string type = "", double weight = 0.0) {</w:t>
+      </w:r>
+    </w:p>
+    <w:p>
+      <w:pPr>
+        <w:spacing w:before="120" w:after="120"/>
         <w:rPr>
           <w:rFonts w:ascii="Consolas" w:hAnsi="Consolas"/>
           <w:sz w:val="18"/>
         </w:rPr>
-        <w:br/>
-        <w:t xml:space="preserve">    string type;    // Private - Information Hiding</w:t>
-      </w:r>
+      </w:pPr>
       <w:r>
         <w:rPr>
           <w:rFonts w:ascii="Consolas" w:hAnsi="Consolas"/>
           <w:sz w:val="18"/>
         </w:rPr>
-        <w:br/>
-        <w:t xml:space="preserve">    double weight;  // Private - Information Hiding</w:t>
-      </w:r>
-      <w:r>
+        <w:t>        // Validation order: Name first, then Weight</w:t>
+      </w:r>
+    </w:p>
+    <w:p>
+      <w:pPr>
+        <w:spacing w:before="120" w:after="120"/>
         <w:rPr>
           <w:rFonts w:ascii="Consolas" w:hAnsi="Consolas"/>
           <w:sz w:val="18"/>
         </w:rPr>
-        <w:br/>
-        <w:t>public:</w:t>
-      </w:r>
+      </w:pPr>
       <w:r>
         <w:rPr>
           <w:rFonts w:ascii="Consolas" w:hAnsi="Consolas"/>
           <w:sz w:val="18"/>
         </w:rPr>
-        <w:br/>
-        <w:t xml:space="preserve">    // Constructor with validation</w:t>
-      </w:r>
+        <w:t>        if (</w:t>
+      </w:r>
+      <w:proofErr w:type="spellStart"/>
+      <w:proofErr w:type="gramStart"/>
       <w:r>
         <w:rPr>
           <w:rFonts w:ascii="Consolas" w:hAnsi="Consolas"/>
           <w:sz w:val="18"/>
         </w:rPr>
-        <w:br/>
-        <w:t xml:space="preserve">    Goods(string name="", string type="", double weight=0.0) {</w:t>
-      </w:r>
+        <w:t>name.empty</w:t>
+      </w:r>
+      <w:proofErr w:type="spellEnd"/>
+      <w:proofErr w:type="gramEnd"/>
       <w:r>
         <w:rPr>
           <w:rFonts w:ascii="Consolas" w:hAnsi="Consolas"/>
           <w:sz w:val="18"/>
         </w:rPr>
-        <w:br/>
-      </w:r>
-      <w:r>
+        <w:t>()) {</w:t>
+      </w:r>
+    </w:p>
+    <w:p>
+      <w:pPr>
+        <w:spacing w:before="120" w:after="120"/>
         <w:rPr>
           <w:rFonts w:ascii="Consolas" w:hAnsi="Consolas"/>
           <w:sz w:val="18"/>
         </w:rPr>
-        <w:lastRenderedPageBreak/>
-        <w:t xml:space="preserve">        if (weight &lt; 0)</w:t>
-      </w:r>
+      </w:pPr>
       <w:r>
         <w:rPr>
           <w:rFonts w:ascii="Consolas" w:hAnsi="Consolas"/>
           <w:sz w:val="18"/>
         </w:rPr>
-        <w:br/>
-        <w:t xml:space="preserve">            throw </w:t>
+        <w:t xml:space="preserve">            throw </w:t>
       </w:r>
       <w:proofErr w:type="spellStart"/>
       <w:r>
@@ -8507,95 +8521,96 @@
           <w:rFonts w:ascii="Consolas" w:hAnsi="Consolas"/>
           <w:sz w:val="18"/>
         </w:rPr>
-        <w:t>invalid_argument</w:t>
-      </w:r>
-      <w:proofErr w:type="spellEnd"/>
+        <w:t>invalid_</w:t>
+      </w:r>
+      <w:proofErr w:type="gramStart"/>
       <w:r>
         <w:rPr>
           <w:rFonts w:ascii="Consolas" w:hAnsi="Consolas"/>
           <w:sz w:val="18"/>
         </w:rPr>
-        <w:t>("Weight cannot be negative");</w:t>
-      </w:r>
+        <w:t>argument</w:t>
+      </w:r>
+      <w:proofErr w:type="spellEnd"/>
       <w:r>
         <w:rPr>
           <w:rFonts w:ascii="Consolas" w:hAnsi="Consolas"/>
           <w:sz w:val="18"/>
         </w:rPr>
-        <w:br/>
-        <w:t xml:space="preserve">        this-&gt;name = name;</w:t>
-      </w:r>
+        <w:t>(</w:t>
+      </w:r>
+      <w:proofErr w:type="gramEnd"/>
       <w:r>
         <w:rPr>
           <w:rFonts w:ascii="Consolas" w:hAnsi="Consolas"/>
           <w:sz w:val="18"/>
         </w:rPr>
-        <w:br/>
-        <w:t xml:space="preserve">        this-&gt;type = type;</w:t>
-      </w:r>
-      <w:r>
+        <w:t>"Name cannot be empty");</w:t>
+      </w:r>
+    </w:p>
+    <w:p>
+      <w:pPr>
+        <w:spacing w:before="120" w:after="120"/>
         <w:rPr>
           <w:rFonts w:ascii="Consolas" w:hAnsi="Consolas"/>
           <w:sz w:val="18"/>
         </w:rPr>
-        <w:br/>
-        <w:t xml:space="preserve">        this-&gt;weight = weight;</w:t>
-      </w:r>
+      </w:pPr>
       <w:r>
         <w:rPr>
           <w:rFonts w:ascii="Consolas" w:hAnsi="Consolas"/>
           <w:sz w:val="18"/>
         </w:rPr>
-        <w:br/>
-        <w:t xml:space="preserve">    }</w:t>
-      </w:r>
-      <w:r>
+        <w:t>        }</w:t>
+      </w:r>
+    </w:p>
+    <w:p>
+      <w:pPr>
+        <w:spacing w:before="120" w:after="120"/>
         <w:rPr>
           <w:rFonts w:ascii="Consolas" w:hAnsi="Consolas"/>
           <w:sz w:val="18"/>
         </w:rPr>
-        <w:br/>
-        <w:t xml:space="preserve">    // Accessor methods (getters)</w:t>
-      </w:r>
+      </w:pPr>
       <w:r>
         <w:rPr>
           <w:rFonts w:ascii="Consolas" w:hAnsi="Consolas"/>
           <w:sz w:val="18"/>
         </w:rPr>
-        <w:br/>
-        <w:t xml:space="preserve">    string </w:t>
-      </w:r>
-      <w:proofErr w:type="spellStart"/>
-      <w:r>
+        <w:lastRenderedPageBreak/>
+        <w:t>        if (weight &lt; 0) {</w:t>
+      </w:r>
+    </w:p>
+    <w:p>
+      <w:pPr>
+        <w:spacing w:before="120" w:after="120"/>
         <w:rPr>
           <w:rFonts w:ascii="Consolas" w:hAnsi="Consolas"/>
           <w:sz w:val="18"/>
         </w:rPr>
-        <w:t>getName</w:t>
-      </w:r>
-      <w:proofErr w:type="spellEnd"/>
+      </w:pPr>
       <w:r>
         <w:rPr>
           <w:rFonts w:ascii="Consolas" w:hAnsi="Consolas"/>
           <w:sz w:val="18"/>
         </w:rPr>
-        <w:t>() const { return name; }</w:t>
-      </w:r>
+        <w:t xml:space="preserve">            throw </w:t>
+      </w:r>
+      <w:proofErr w:type="spellStart"/>
       <w:r>
         <w:rPr>
           <w:rFonts w:ascii="Consolas" w:hAnsi="Consolas"/>
           <w:sz w:val="18"/>
         </w:rPr>
-        <w:br/>
-        <w:t xml:space="preserve">    string </w:t>
-      </w:r>
-      <w:proofErr w:type="spellStart"/>
+        <w:t>invalid_</w:t>
+      </w:r>
+      <w:proofErr w:type="gramStart"/>
       <w:r>
         <w:rPr>
           <w:rFonts w:ascii="Consolas" w:hAnsi="Consolas"/>
           <w:sz w:val="18"/>
         </w:rPr>
-        <w:t>getType</w:t>
+        <w:t>argument</w:t>
       </w:r>
       <w:proofErr w:type="spellEnd"/>
       <w:r>
@@ -8603,296 +8618,879 @@
           <w:rFonts w:ascii="Consolas" w:hAnsi="Consolas"/>
           <w:sz w:val="18"/>
         </w:rPr>
-        <w:t>() const { return type; }</w:t>
-      </w:r>
+        <w:t>(</w:t>
+      </w:r>
+      <w:proofErr w:type="gramEnd"/>
       <w:r>
         <w:rPr>
           <w:rFonts w:ascii="Consolas" w:hAnsi="Consolas"/>
           <w:sz w:val="18"/>
         </w:rPr>
-        <w:br/>
-        <w:t xml:space="preserve">    double </w:t>
-      </w:r>
-      <w:proofErr w:type="spellStart"/>
-      <w:r>
+        <w:t>"Weight cannot be negative");</w:t>
+      </w:r>
+    </w:p>
+    <w:p>
+      <w:pPr>
+        <w:spacing w:before="120" w:after="120"/>
         <w:rPr>
           <w:rFonts w:ascii="Consolas" w:hAnsi="Consolas"/>
           <w:sz w:val="18"/>
         </w:rPr>
-        <w:t>getWeight</w:t>
-      </w:r>
-      <w:proofErr w:type="spellEnd"/>
+      </w:pPr>
       <w:r>
         <w:rPr>
           <w:rFonts w:ascii="Consolas" w:hAnsi="Consolas"/>
           <w:sz w:val="18"/>
         </w:rPr>
-        <w:t>() const { return weight; }</w:t>
-      </w:r>
-      <w:r>
+        <w:t>        }</w:t>
+      </w:r>
+    </w:p>
+    <w:p>
+      <w:pPr>
+        <w:spacing w:before="120" w:after="120"/>
         <w:rPr>
           <w:rFonts w:ascii="Consolas" w:hAnsi="Consolas"/>
           <w:sz w:val="18"/>
         </w:rPr>
-        <w:br/>
-        <w:t xml:space="preserve">    // Mutator methods with validation (setters)</w:t>
-      </w:r>
+      </w:pPr>
       <w:r>
         <w:rPr>
           <w:rFonts w:ascii="Consolas" w:hAnsi="Consolas"/>
           <w:sz w:val="18"/>
         </w:rPr>
-        <w:br/>
-        <w:t xml:space="preserve">    void </w:t>
-      </w:r>
-      <w:proofErr w:type="spellStart"/>
-      <w:r>
+        <w:t>        this-&gt;name = name;</w:t>
+      </w:r>
+    </w:p>
+    <w:p>
+      <w:pPr>
+        <w:spacing w:before="120" w:after="120"/>
         <w:rPr>
           <w:rFonts w:ascii="Consolas" w:hAnsi="Consolas"/>
           <w:sz w:val="18"/>
         </w:rPr>
-        <w:t>setName</w:t>
-      </w:r>
-      <w:proofErr w:type="spellEnd"/>
+      </w:pPr>
       <w:r>
         <w:rPr>
           <w:rFonts w:ascii="Consolas" w:hAnsi="Consolas"/>
           <w:sz w:val="18"/>
         </w:rPr>
-        <w:t xml:space="preserve">(const string&amp; </w:t>
-      </w:r>
-      <w:proofErr w:type="spellStart"/>
-      <w:r>
+        <w:t>        this-&gt;type = type;</w:t>
+      </w:r>
+    </w:p>
+    <w:p>
+      <w:pPr>
+        <w:spacing w:before="120" w:after="120"/>
         <w:rPr>
           <w:rFonts w:ascii="Consolas" w:hAnsi="Consolas"/>
           <w:sz w:val="18"/>
         </w:rPr>
-        <w:t>newName</w:t>
-      </w:r>
-      <w:proofErr w:type="spellEnd"/>
+      </w:pPr>
       <w:r>
         <w:rPr>
           <w:rFonts w:ascii="Consolas" w:hAnsi="Consolas"/>
           <w:sz w:val="18"/>
         </w:rPr>
-        <w:t>) {</w:t>
-      </w:r>
-      <w:r>
+        <w:t>        this-&gt;weight = weight;</w:t>
+      </w:r>
+    </w:p>
+    <w:p>
+      <w:pPr>
+        <w:spacing w:before="120" w:after="120"/>
         <w:rPr>
           <w:rFonts w:ascii="Consolas" w:hAnsi="Consolas"/>
           <w:sz w:val="18"/>
         </w:rPr>
-        <w:br/>
-        <w:t xml:space="preserve">        if (</w:t>
-      </w:r>
-      <w:proofErr w:type="spellStart"/>
+      </w:pPr>
       <w:r>
         <w:rPr>
           <w:rFonts w:ascii="Consolas" w:hAnsi="Consolas"/>
           <w:sz w:val="18"/>
         </w:rPr>
-        <w:t>newName.empty</w:t>
-      </w:r>
-      <w:proofErr w:type="spellEnd"/>
-      <w:r>
+        <w:t>    }</w:t>
+      </w:r>
+    </w:p>
+    <w:p>
+      <w:pPr>
+        <w:spacing w:before="120" w:after="120"/>
         <w:rPr>
           <w:rFonts w:ascii="Consolas" w:hAnsi="Consolas"/>
           <w:sz w:val="18"/>
         </w:rPr>
-        <w:t>())</w:t>
-      </w:r>
-      <w:r>
+      </w:pPr>
+    </w:p>
+    <w:p>
+      <w:pPr>
+        <w:spacing w:before="120" w:after="120"/>
         <w:rPr>
           <w:rFonts w:ascii="Consolas" w:hAnsi="Consolas"/>
           <w:sz w:val="18"/>
         </w:rPr>
-        <w:br/>
-        <w:t xml:space="preserve">            throw </w:t>
-      </w:r>
-      <w:proofErr w:type="spellStart"/>
+      </w:pPr>
       <w:r>
         <w:rPr>
           <w:rFonts w:ascii="Consolas" w:hAnsi="Consolas"/>
           <w:sz w:val="18"/>
         </w:rPr>
-        <w:t>invalid_argument</w:t>
-      </w:r>
-      <w:proofErr w:type="spellEnd"/>
-      <w:r>
+        <w:t>    // --- Accessor Methods (Getters) ---</w:t>
+      </w:r>
+    </w:p>
+    <w:p>
+      <w:pPr>
+        <w:spacing w:before="120" w:after="120"/>
         <w:rPr>
           <w:rFonts w:ascii="Consolas" w:hAnsi="Consolas"/>
           <w:sz w:val="18"/>
         </w:rPr>
-        <w:t>("Name cannot be empty");</w:t>
-      </w:r>
+      </w:pPr>
       <w:r>
         <w:rPr>
           <w:rFonts w:ascii="Consolas" w:hAnsi="Consolas"/>
           <w:sz w:val="18"/>
         </w:rPr>
-        <w:br/>
-        <w:t xml:space="preserve">        name = </w:t>
-      </w:r>
-      <w:proofErr w:type="spellStart"/>
-      <w:r>
+        <w:t>    // These provide read-only access to private data</w:t>
+      </w:r>
+    </w:p>
+    <w:p>
+      <w:pPr>
+        <w:spacing w:before="120" w:after="120"/>
         <w:rPr>
           <w:rFonts w:ascii="Consolas" w:hAnsi="Consolas"/>
           <w:sz w:val="18"/>
         </w:rPr>
-        <w:t>newName</w:t>
-      </w:r>
-      <w:proofErr w:type="spellEnd"/>
+      </w:pPr>
       <w:r>
         <w:rPr>
           <w:rFonts w:ascii="Consolas" w:hAnsi="Consolas"/>
           <w:sz w:val="18"/>
         </w:rPr>
-        <w:t>;</w:t>
-      </w:r>
+        <w:t xml:space="preserve">    string </w:t>
+      </w:r>
+      <w:proofErr w:type="spellStart"/>
+      <w:proofErr w:type="gramStart"/>
       <w:r>
         <w:rPr>
           <w:rFonts w:ascii="Consolas" w:hAnsi="Consolas"/>
           <w:sz w:val="18"/>
         </w:rPr>
-        <w:br/>
-        <w:t xml:space="preserve">    }</w:t>
-      </w:r>
+        <w:t>getName</w:t>
+      </w:r>
+      <w:proofErr w:type="spellEnd"/>
       <w:r>
         <w:rPr>
           <w:rFonts w:ascii="Consolas" w:hAnsi="Consolas"/>
           <w:sz w:val="18"/>
         </w:rPr>
-        <w:br/>
-        <w:t xml:space="preserve">    void </w:t>
-      </w:r>
-      <w:proofErr w:type="spellStart"/>
+        <w:t>(</w:t>
+      </w:r>
+      <w:proofErr w:type="gramEnd"/>
       <w:r>
         <w:rPr>
           <w:rFonts w:ascii="Consolas" w:hAnsi="Consolas"/>
           <w:sz w:val="18"/>
         </w:rPr>
-        <w:t>setWeight</w:t>
-      </w:r>
-      <w:proofErr w:type="spellEnd"/>
+        <w:t xml:space="preserve">) const </w:t>
+      </w:r>
+      <w:proofErr w:type="gramStart"/>
       <w:r>
         <w:rPr>
           <w:rFonts w:ascii="Consolas" w:hAnsi="Consolas"/>
           <w:sz w:val="18"/>
         </w:rPr>
-        <w:t xml:space="preserve">(double </w:t>
-      </w:r>
-      <w:proofErr w:type="spellStart"/>
+        <w:t>{ return</w:t>
+      </w:r>
+      <w:proofErr w:type="gramEnd"/>
       <w:r>
         <w:rPr>
           <w:rFonts w:ascii="Consolas" w:hAnsi="Consolas"/>
           <w:sz w:val="18"/>
         </w:rPr>
-        <w:t>newWeight</w:t>
-      </w:r>
-      <w:proofErr w:type="spellEnd"/>
+        <w:t xml:space="preserve"> name</w:t>
+      </w:r>
+      <w:proofErr w:type="gramStart"/>
       <w:r>
         <w:rPr>
           <w:rFonts w:ascii="Consolas" w:hAnsi="Consolas"/>
           <w:sz w:val="18"/>
         </w:rPr>
-        <w:t>) {</w:t>
-      </w:r>
-      <w:r>
+        <w:t>; }</w:t>
+      </w:r>
+      <w:proofErr w:type="gramEnd"/>
+    </w:p>
+    <w:p>
+      <w:pPr>
+        <w:spacing w:before="120" w:after="120"/>
         <w:rPr>
           <w:rFonts w:ascii="Consolas" w:hAnsi="Consolas"/>
           <w:sz w:val="18"/>
         </w:rPr>
-        <w:br/>
-        <w:t xml:space="preserve">        if (</w:t>
-      </w:r>
-      <w:proofErr w:type="spellStart"/>
+      </w:pPr>
       <w:r>
         <w:rPr>
           <w:rFonts w:ascii="Consolas" w:hAnsi="Consolas"/>
           <w:sz w:val="18"/>
         </w:rPr>
-        <w:t>newWeight</w:t>
-      </w:r>
-      <w:proofErr w:type="spellEnd"/>
+        <w:t xml:space="preserve">    string </w:t>
+      </w:r>
+      <w:proofErr w:type="spellStart"/>
+      <w:proofErr w:type="gramStart"/>
       <w:r>
         <w:rPr>
           <w:rFonts w:ascii="Consolas" w:hAnsi="Consolas"/>
           <w:sz w:val="18"/>
         </w:rPr>
-        <w:t xml:space="preserve"> &lt; 0)</w:t>
-      </w:r>
+        <w:t>getType</w:t>
+      </w:r>
+      <w:proofErr w:type="spellEnd"/>
       <w:r>
         <w:rPr>
           <w:rFonts w:ascii="Consolas" w:hAnsi="Consolas"/>
           <w:sz w:val="18"/>
         </w:rPr>
-        <w:br/>
-        <w:t xml:space="preserve">            throw </w:t>
-      </w:r>
-      <w:proofErr w:type="spellStart"/>
+        <w:t>(</w:t>
+      </w:r>
+      <w:proofErr w:type="gramEnd"/>
       <w:r>
         <w:rPr>
           <w:rFonts w:ascii="Consolas" w:hAnsi="Consolas"/>
           <w:sz w:val="18"/>
         </w:rPr>
-        <w:t>invalid_argument</w:t>
-      </w:r>
-      <w:proofErr w:type="spellEnd"/>
+        <w:t xml:space="preserve">) const </w:t>
+      </w:r>
+      <w:proofErr w:type="gramStart"/>
       <w:r>
         <w:rPr>
           <w:rFonts w:ascii="Consolas" w:hAnsi="Consolas"/>
           <w:sz w:val="18"/>
         </w:rPr>
-        <w:t>("Weight cannot be negative");</w:t>
-      </w:r>
+        <w:t>{ return</w:t>
+      </w:r>
+      <w:proofErr w:type="gramEnd"/>
       <w:r>
         <w:rPr>
           <w:rFonts w:ascii="Consolas" w:hAnsi="Consolas"/>
           <w:sz w:val="18"/>
         </w:rPr>
-        <w:br/>
-        <w:t xml:space="preserve">        weight = </w:t>
-      </w:r>
-      <w:proofErr w:type="spellStart"/>
+        <w:t xml:space="preserve"> type</w:t>
+      </w:r>
+      <w:proofErr w:type="gramStart"/>
       <w:r>
         <w:rPr>
           <w:rFonts w:ascii="Consolas" w:hAnsi="Consolas"/>
           <w:sz w:val="18"/>
         </w:rPr>
-        <w:t>newWeight</w:t>
-      </w:r>
-      <w:proofErr w:type="spellEnd"/>
-      <w:r>
+        <w:t>; }</w:t>
+      </w:r>
+      <w:proofErr w:type="gramEnd"/>
+    </w:p>
+    <w:p>
+      <w:pPr>
+        <w:spacing w:before="120" w:after="120"/>
         <w:rPr>
           <w:rFonts w:ascii="Consolas" w:hAnsi="Consolas"/>
           <w:sz w:val="18"/>
         </w:rPr>
-        <w:t>;</w:t>
-      </w:r>
+      </w:pPr>
       <w:r>
         <w:rPr>
           <w:rFonts w:ascii="Consolas" w:hAnsi="Consolas"/>
           <w:sz w:val="18"/>
         </w:rPr>
-        <w:br/>
-        <w:t xml:space="preserve">    }</w:t>
-      </w:r>
+        <w:t xml:space="preserve">    double </w:t>
+      </w:r>
+      <w:proofErr w:type="spellStart"/>
+      <w:proofErr w:type="gramStart"/>
       <w:r>
         <w:rPr>
           <w:rFonts w:ascii="Consolas" w:hAnsi="Consolas"/>
           <w:sz w:val="18"/>
         </w:rPr>
-        <w:br/>
-        <w:t>};</w:t>
-      </w:r>
+        <w:t>getWeight</w:t>
+      </w:r>
+      <w:proofErr w:type="spellEnd"/>
+      <w:r>
+        <w:rPr>
+          <w:rFonts w:ascii="Consolas" w:hAnsi="Consolas"/>
+          <w:sz w:val="18"/>
+        </w:rPr>
+        <w:t>(</w:t>
+      </w:r>
+      <w:proofErr w:type="gramEnd"/>
+      <w:r>
+        <w:rPr>
+          <w:rFonts w:ascii="Consolas" w:hAnsi="Consolas"/>
+          <w:sz w:val="18"/>
+        </w:rPr>
+        <w:t xml:space="preserve">) const </w:t>
+      </w:r>
+      <w:proofErr w:type="gramStart"/>
+      <w:r>
+        <w:rPr>
+          <w:rFonts w:ascii="Consolas" w:hAnsi="Consolas"/>
+          <w:sz w:val="18"/>
+        </w:rPr>
+        <w:t>{ return</w:t>
+      </w:r>
+      <w:proofErr w:type="gramEnd"/>
+      <w:r>
+        <w:rPr>
+          <w:rFonts w:ascii="Consolas" w:hAnsi="Consolas"/>
+          <w:sz w:val="18"/>
+        </w:rPr>
+        <w:t xml:space="preserve"> weight</w:t>
+      </w:r>
+      <w:proofErr w:type="gramStart"/>
+      <w:r>
+        <w:rPr>
+          <w:rFonts w:ascii="Consolas" w:hAnsi="Consolas"/>
+          <w:sz w:val="18"/>
+        </w:rPr>
+        <w:t>; }</w:t>
+      </w:r>
+      <w:proofErr w:type="gramEnd"/>
     </w:p>
     <w:p>
       <w:pPr>
         <w:spacing w:before="120" w:after="120"/>
+        <w:rPr>
+          <w:rFonts w:ascii="Consolas" w:hAnsi="Consolas"/>
+          <w:sz w:val="18"/>
+        </w:rPr>
       </w:pPr>
     </w:p>
     <w:p>
       <w:pPr>
+        <w:spacing w:before="120" w:after="120"/>
+        <w:rPr>
+          <w:rFonts w:ascii="Consolas" w:hAnsi="Consolas"/>
+          <w:sz w:val="18"/>
+        </w:rPr>
+      </w:pPr>
+      <w:r>
+        <w:rPr>
+          <w:rFonts w:ascii="Consolas" w:hAnsi="Consolas"/>
+          <w:sz w:val="18"/>
+        </w:rPr>
+        <w:t>    // --- Mutator Methods (Setters) with Validation ---</w:t>
+      </w:r>
+    </w:p>
+    <w:p>
+      <w:pPr>
+        <w:spacing w:before="120" w:after="120"/>
+        <w:rPr>
+          <w:rFonts w:ascii="Consolas" w:hAnsi="Consolas"/>
+          <w:sz w:val="18"/>
+        </w:rPr>
+      </w:pPr>
+      <w:r>
+        <w:rPr>
+          <w:rFonts w:ascii="Consolas" w:hAnsi="Consolas"/>
+          <w:sz w:val="18"/>
+        </w:rPr>
+        <w:t>    // These enforce business rules before modifying data</w:t>
+      </w:r>
+    </w:p>
+    <w:p>
+      <w:pPr>
+        <w:spacing w:before="120" w:after="120"/>
+        <w:rPr>
+          <w:rFonts w:ascii="Consolas" w:hAnsi="Consolas"/>
+          <w:sz w:val="18"/>
+        </w:rPr>
+      </w:pPr>
+      <w:r>
+        <w:rPr>
+          <w:rFonts w:ascii="Consolas" w:hAnsi="Consolas"/>
+          <w:sz w:val="18"/>
+        </w:rPr>
+        <w:t xml:space="preserve">    void </w:t>
+      </w:r>
+      <w:proofErr w:type="spellStart"/>
+      <w:proofErr w:type="gramStart"/>
+      <w:r>
+        <w:rPr>
+          <w:rFonts w:ascii="Consolas" w:hAnsi="Consolas"/>
+          <w:sz w:val="18"/>
+        </w:rPr>
+        <w:t>setName</w:t>
+      </w:r>
+      <w:proofErr w:type="spellEnd"/>
+      <w:r>
+        <w:rPr>
+          <w:rFonts w:ascii="Consolas" w:hAnsi="Consolas"/>
+          <w:sz w:val="18"/>
+        </w:rPr>
+        <w:t>(</w:t>
+      </w:r>
+      <w:proofErr w:type="gramEnd"/>
+      <w:r>
+        <w:rPr>
+          <w:rFonts w:ascii="Consolas" w:hAnsi="Consolas"/>
+          <w:sz w:val="18"/>
+        </w:rPr>
+        <w:t xml:space="preserve">const string&amp; </w:t>
+      </w:r>
+      <w:proofErr w:type="spellStart"/>
+      <w:r>
+        <w:rPr>
+          <w:rFonts w:ascii="Consolas" w:hAnsi="Consolas"/>
+          <w:sz w:val="18"/>
+        </w:rPr>
+        <w:t>newName</w:t>
+      </w:r>
+      <w:proofErr w:type="spellEnd"/>
+      <w:r>
+        <w:rPr>
+          <w:rFonts w:ascii="Consolas" w:hAnsi="Consolas"/>
+          <w:sz w:val="18"/>
+        </w:rPr>
+        <w:t>) {</w:t>
+      </w:r>
+    </w:p>
+    <w:p>
+      <w:pPr>
+        <w:spacing w:before="120" w:after="120"/>
+        <w:rPr>
+          <w:rFonts w:ascii="Consolas" w:hAnsi="Consolas"/>
+          <w:sz w:val="18"/>
+        </w:rPr>
+      </w:pPr>
+      <w:r>
+        <w:rPr>
+          <w:rFonts w:ascii="Consolas" w:hAnsi="Consolas"/>
+          <w:sz w:val="18"/>
+        </w:rPr>
+        <w:t>        if (</w:t>
+      </w:r>
+      <w:proofErr w:type="spellStart"/>
+      <w:r>
+        <w:rPr>
+          <w:rFonts w:ascii="Consolas" w:hAnsi="Consolas"/>
+          <w:sz w:val="18"/>
+        </w:rPr>
+        <w:t>newName.empty</w:t>
+      </w:r>
+      <w:proofErr w:type="spellEnd"/>
+      <w:r>
+        <w:rPr>
+          <w:rFonts w:ascii="Consolas" w:hAnsi="Consolas"/>
+          <w:sz w:val="18"/>
+        </w:rPr>
+        <w:t>())</w:t>
+      </w:r>
+    </w:p>
+    <w:p>
+      <w:pPr>
+        <w:spacing w:before="120" w:after="120"/>
+        <w:rPr>
+          <w:rFonts w:ascii="Consolas" w:hAnsi="Consolas"/>
+          <w:sz w:val="18"/>
+        </w:rPr>
+      </w:pPr>
+      <w:r>
+        <w:rPr>
+          <w:rFonts w:ascii="Consolas" w:hAnsi="Consolas"/>
+          <w:sz w:val="18"/>
+        </w:rPr>
+        <w:t xml:space="preserve">            throw </w:t>
+      </w:r>
+      <w:proofErr w:type="spellStart"/>
+      <w:r>
+        <w:rPr>
+          <w:rFonts w:ascii="Consolas" w:hAnsi="Consolas"/>
+          <w:sz w:val="18"/>
+        </w:rPr>
+        <w:t>invalid_</w:t>
+      </w:r>
+      <w:proofErr w:type="gramStart"/>
+      <w:r>
+        <w:rPr>
+          <w:rFonts w:ascii="Consolas" w:hAnsi="Consolas"/>
+          <w:sz w:val="18"/>
+        </w:rPr>
+        <w:t>argument</w:t>
+      </w:r>
+      <w:proofErr w:type="spellEnd"/>
+      <w:r>
+        <w:rPr>
+          <w:rFonts w:ascii="Consolas" w:hAnsi="Consolas"/>
+          <w:sz w:val="18"/>
+        </w:rPr>
+        <w:t>(</w:t>
+      </w:r>
+      <w:proofErr w:type="gramEnd"/>
+      <w:r>
+        <w:rPr>
+          <w:rFonts w:ascii="Consolas" w:hAnsi="Consolas"/>
+          <w:sz w:val="18"/>
+        </w:rPr>
+        <w:t>"Name cannot be empty");</w:t>
+      </w:r>
+    </w:p>
+    <w:p>
+      <w:pPr>
+        <w:spacing w:before="120" w:after="120"/>
+        <w:rPr>
+          <w:rFonts w:ascii="Consolas" w:hAnsi="Consolas"/>
+          <w:sz w:val="18"/>
+        </w:rPr>
+      </w:pPr>
+      <w:r>
+        <w:rPr>
+          <w:rFonts w:ascii="Consolas" w:hAnsi="Consolas"/>
+          <w:sz w:val="18"/>
+        </w:rPr>
+        <w:t xml:space="preserve">        name = </w:t>
+      </w:r>
+      <w:proofErr w:type="spellStart"/>
+      <w:r>
+        <w:rPr>
+          <w:rFonts w:ascii="Consolas" w:hAnsi="Consolas"/>
+          <w:sz w:val="18"/>
+        </w:rPr>
+        <w:t>newName</w:t>
+      </w:r>
+      <w:proofErr w:type="spellEnd"/>
+      <w:r>
+        <w:rPr>
+          <w:rFonts w:ascii="Consolas" w:hAnsi="Consolas"/>
+          <w:sz w:val="18"/>
+        </w:rPr>
+        <w:t>;</w:t>
+      </w:r>
+    </w:p>
+    <w:p>
+      <w:pPr>
+        <w:spacing w:before="120" w:after="120"/>
+        <w:rPr>
+          <w:rFonts w:ascii="Consolas" w:hAnsi="Consolas"/>
+          <w:sz w:val="18"/>
+        </w:rPr>
+      </w:pPr>
+      <w:r>
+        <w:rPr>
+          <w:rFonts w:ascii="Consolas" w:hAnsi="Consolas"/>
+          <w:sz w:val="18"/>
+        </w:rPr>
+        <w:t>    }</w:t>
+      </w:r>
+    </w:p>
+    <w:p>
+      <w:pPr>
+        <w:spacing w:before="120" w:after="120"/>
+        <w:rPr>
+          <w:rFonts w:ascii="Consolas" w:hAnsi="Consolas"/>
+          <w:sz w:val="18"/>
+        </w:rPr>
+      </w:pPr>
+    </w:p>
+    <w:p>
+      <w:pPr>
+        <w:spacing w:before="120" w:after="120"/>
+        <w:rPr>
+          <w:rFonts w:ascii="Consolas" w:hAnsi="Consolas"/>
+          <w:sz w:val="18"/>
+        </w:rPr>
+      </w:pPr>
+      <w:r>
+        <w:rPr>
+          <w:rFonts w:ascii="Consolas" w:hAnsi="Consolas"/>
+          <w:sz w:val="18"/>
+        </w:rPr>
+        <w:t xml:space="preserve">    void </w:t>
+      </w:r>
+      <w:proofErr w:type="spellStart"/>
+      <w:proofErr w:type="gramStart"/>
+      <w:r>
+        <w:rPr>
+          <w:rFonts w:ascii="Consolas" w:hAnsi="Consolas"/>
+          <w:sz w:val="18"/>
+        </w:rPr>
+        <w:t>setType</w:t>
+      </w:r>
+      <w:proofErr w:type="spellEnd"/>
+      <w:r>
+        <w:rPr>
+          <w:rFonts w:ascii="Consolas" w:hAnsi="Consolas"/>
+          <w:sz w:val="18"/>
+        </w:rPr>
+        <w:t>(</w:t>
+      </w:r>
+      <w:proofErr w:type="gramEnd"/>
+      <w:r>
+        <w:rPr>
+          <w:rFonts w:ascii="Consolas" w:hAnsi="Consolas"/>
+          <w:sz w:val="18"/>
+        </w:rPr>
+        <w:t xml:space="preserve">const string&amp; </w:t>
+      </w:r>
+      <w:proofErr w:type="spellStart"/>
+      <w:r>
+        <w:rPr>
+          <w:rFonts w:ascii="Consolas" w:hAnsi="Consolas"/>
+          <w:sz w:val="18"/>
+        </w:rPr>
+        <w:t>newType</w:t>
+      </w:r>
+      <w:proofErr w:type="spellEnd"/>
+      <w:r>
+        <w:rPr>
+          <w:rFonts w:ascii="Consolas" w:hAnsi="Consolas"/>
+          <w:sz w:val="18"/>
+        </w:rPr>
+        <w:t xml:space="preserve">) </w:t>
+      </w:r>
+      <w:proofErr w:type="gramStart"/>
+      <w:r>
+        <w:rPr>
+          <w:rFonts w:ascii="Consolas" w:hAnsi="Consolas"/>
+          <w:sz w:val="18"/>
+        </w:rPr>
+        <w:t>{ type</w:t>
+      </w:r>
+      <w:proofErr w:type="gramEnd"/>
+      <w:r>
+        <w:rPr>
+          <w:rFonts w:ascii="Consolas" w:hAnsi="Consolas"/>
+          <w:sz w:val="18"/>
+        </w:rPr>
+        <w:t xml:space="preserve"> = </w:t>
+      </w:r>
+      <w:proofErr w:type="spellStart"/>
+      <w:r>
+        <w:rPr>
+          <w:rFonts w:ascii="Consolas" w:hAnsi="Consolas"/>
+          <w:sz w:val="18"/>
+        </w:rPr>
+        <w:t>newType</w:t>
+      </w:r>
+      <w:proofErr w:type="spellEnd"/>
+      <w:proofErr w:type="gramStart"/>
+      <w:r>
+        <w:rPr>
+          <w:rFonts w:ascii="Consolas" w:hAnsi="Consolas"/>
+          <w:sz w:val="18"/>
+        </w:rPr>
+        <w:t>; }</w:t>
+      </w:r>
+      <w:proofErr w:type="gramEnd"/>
+    </w:p>
+    <w:p>
+      <w:pPr>
+        <w:spacing w:before="120" w:after="120"/>
+        <w:rPr>
+          <w:rFonts w:ascii="Consolas" w:hAnsi="Consolas"/>
+          <w:sz w:val="18"/>
+        </w:rPr>
+      </w:pPr>
+    </w:p>
+    <w:p>
+      <w:pPr>
+        <w:spacing w:before="120" w:after="120"/>
+        <w:rPr>
+          <w:rFonts w:ascii="Consolas" w:hAnsi="Consolas"/>
+          <w:sz w:val="18"/>
+        </w:rPr>
+      </w:pPr>
+      <w:r>
+        <w:rPr>
+          <w:rFonts w:ascii="Consolas" w:hAnsi="Consolas"/>
+          <w:sz w:val="18"/>
+        </w:rPr>
+        <w:t xml:space="preserve">    void </w:t>
+      </w:r>
+      <w:proofErr w:type="spellStart"/>
+      <w:proofErr w:type="gramStart"/>
+      <w:r>
+        <w:rPr>
+          <w:rFonts w:ascii="Consolas" w:hAnsi="Consolas"/>
+          <w:sz w:val="18"/>
+        </w:rPr>
+        <w:t>setWeight</w:t>
+      </w:r>
+      <w:proofErr w:type="spellEnd"/>
+      <w:r>
+        <w:rPr>
+          <w:rFonts w:ascii="Consolas" w:hAnsi="Consolas"/>
+          <w:sz w:val="18"/>
+        </w:rPr>
+        <w:t>(</w:t>
+      </w:r>
+      <w:proofErr w:type="gramEnd"/>
+      <w:r>
+        <w:rPr>
+          <w:rFonts w:ascii="Consolas" w:hAnsi="Consolas"/>
+          <w:sz w:val="18"/>
+        </w:rPr>
+        <w:t xml:space="preserve">double </w:t>
+      </w:r>
+      <w:proofErr w:type="spellStart"/>
+      <w:r>
+        <w:rPr>
+          <w:rFonts w:ascii="Consolas" w:hAnsi="Consolas"/>
+          <w:sz w:val="18"/>
+        </w:rPr>
+        <w:t>newWeight</w:t>
+      </w:r>
+      <w:proofErr w:type="spellEnd"/>
+      <w:r>
+        <w:rPr>
+          <w:rFonts w:ascii="Consolas" w:hAnsi="Consolas"/>
+          <w:sz w:val="18"/>
+        </w:rPr>
+        <w:t>) {</w:t>
+      </w:r>
+    </w:p>
+    <w:p>
+      <w:pPr>
+        <w:spacing w:before="120" w:after="120"/>
+        <w:rPr>
+          <w:rFonts w:ascii="Consolas" w:hAnsi="Consolas"/>
+          <w:sz w:val="18"/>
+        </w:rPr>
+      </w:pPr>
+      <w:r>
+        <w:rPr>
+          <w:rFonts w:ascii="Consolas" w:hAnsi="Consolas"/>
+          <w:sz w:val="18"/>
+        </w:rPr>
+        <w:t>        if (</w:t>
+      </w:r>
+      <w:proofErr w:type="spellStart"/>
+      <w:r>
+        <w:rPr>
+          <w:rFonts w:ascii="Consolas" w:hAnsi="Consolas"/>
+          <w:sz w:val="18"/>
+        </w:rPr>
+        <w:t>newWeight</w:t>
+      </w:r>
+      <w:proofErr w:type="spellEnd"/>
+      <w:r>
+        <w:rPr>
+          <w:rFonts w:ascii="Consolas" w:hAnsi="Consolas"/>
+          <w:sz w:val="18"/>
+        </w:rPr>
+        <w:t xml:space="preserve"> &lt; 0) {</w:t>
+      </w:r>
+    </w:p>
+    <w:p>
+      <w:pPr>
+        <w:spacing w:before="120" w:after="120"/>
+        <w:rPr>
+          <w:rFonts w:ascii="Consolas" w:hAnsi="Consolas"/>
+          <w:sz w:val="18"/>
+        </w:rPr>
+      </w:pPr>
+      <w:r>
+        <w:rPr>
+          <w:rFonts w:ascii="Consolas" w:hAnsi="Consolas"/>
+          <w:sz w:val="18"/>
+        </w:rPr>
+        <w:t xml:space="preserve">            throw </w:t>
+      </w:r>
+      <w:proofErr w:type="spellStart"/>
+      <w:r>
+        <w:rPr>
+          <w:rFonts w:ascii="Consolas" w:hAnsi="Consolas"/>
+          <w:sz w:val="18"/>
+        </w:rPr>
+        <w:t>invalid_</w:t>
+      </w:r>
+      <w:proofErr w:type="gramStart"/>
+      <w:r>
+        <w:rPr>
+          <w:rFonts w:ascii="Consolas" w:hAnsi="Consolas"/>
+          <w:sz w:val="18"/>
+        </w:rPr>
+        <w:t>argument</w:t>
+      </w:r>
+      <w:proofErr w:type="spellEnd"/>
+      <w:r>
+        <w:rPr>
+          <w:rFonts w:ascii="Consolas" w:hAnsi="Consolas"/>
+          <w:sz w:val="18"/>
+        </w:rPr>
+        <w:t>(</w:t>
+      </w:r>
+      <w:proofErr w:type="gramEnd"/>
+      <w:r>
+        <w:rPr>
+          <w:rFonts w:ascii="Consolas" w:hAnsi="Consolas"/>
+          <w:sz w:val="18"/>
+        </w:rPr>
+        <w:t>"Weight cannot be negative");</w:t>
+      </w:r>
+    </w:p>
+    <w:p>
+      <w:pPr>
+        <w:spacing w:before="120" w:after="120"/>
+        <w:rPr>
+          <w:rFonts w:ascii="Consolas" w:hAnsi="Consolas"/>
+          <w:sz w:val="18"/>
+        </w:rPr>
+      </w:pPr>
+      <w:r>
+        <w:rPr>
+          <w:rFonts w:ascii="Consolas" w:hAnsi="Consolas"/>
+          <w:sz w:val="18"/>
+        </w:rPr>
+        <w:t>        }</w:t>
+      </w:r>
+    </w:p>
+    <w:p>
+      <w:pPr>
+        <w:spacing w:before="120" w:after="120"/>
+        <w:rPr>
+          <w:rFonts w:ascii="Consolas" w:hAnsi="Consolas"/>
+          <w:sz w:val="18"/>
+        </w:rPr>
+      </w:pPr>
+      <w:r>
+        <w:rPr>
+          <w:rFonts w:ascii="Consolas" w:hAnsi="Consolas"/>
+          <w:sz w:val="18"/>
+        </w:rPr>
+        <w:t xml:space="preserve">        weight = </w:t>
+      </w:r>
+      <w:proofErr w:type="spellStart"/>
+      <w:r>
+        <w:rPr>
+          <w:rFonts w:ascii="Consolas" w:hAnsi="Consolas"/>
+          <w:sz w:val="18"/>
+        </w:rPr>
+        <w:t>newWeight</w:t>
+      </w:r>
+      <w:proofErr w:type="spellEnd"/>
+      <w:r>
+        <w:rPr>
+          <w:rFonts w:ascii="Consolas" w:hAnsi="Consolas"/>
+          <w:sz w:val="18"/>
+        </w:rPr>
+        <w:t>;</w:t>
+      </w:r>
+    </w:p>
+    <w:p>
+      <w:pPr>
+        <w:spacing w:before="120" w:after="120"/>
+        <w:rPr>
+          <w:rFonts w:ascii="Consolas" w:hAnsi="Consolas"/>
+          <w:sz w:val="18"/>
+        </w:rPr>
+      </w:pPr>
+      <w:r>
+        <w:rPr>
+          <w:rFonts w:ascii="Consolas" w:hAnsi="Consolas"/>
+          <w:sz w:val="18"/>
+        </w:rPr>
+        <w:t>    }</w:t>
+      </w:r>
+    </w:p>
+    <w:p>
+      <w:pPr>
+        <w:spacing w:before="120" w:after="120"/>
+      </w:pPr>
+    </w:p>
+    <w:p>
+      <w:pPr>
         <w:pStyle w:val="SBSFormat"/>
       </w:pPr>
       <w:r>
@@ -8909,7 +9507,11 @@
       </w:r>
       <w:proofErr w:type="spellEnd"/>
       <w:r>
-        <w:t xml:space="preserve"> exception is thrown so corrupted data are prevented from getting into the logistics pipeline. Also, a const qualifier on getter methods is a promise that a call to </w:t>
+        <w:t xml:space="preserve"> exception is thrown so corrupted data are prevented from getting into the logistics pipeline. Also, a const qualifier on getter methods is a promise that </w:t>
+      </w:r>
+      <w:r>
+        <w:lastRenderedPageBreak/>
+        <w:t xml:space="preserve">a call to </w:t>
       </w:r>
       <w:proofErr w:type="spellStart"/>
       <w:proofErr w:type="gramStart"/>
@@ -8941,11 +9543,7 @@
         <w:pStyle w:val="SBSFormat"/>
       </w:pPr>
       <w:r>
-        <w:t xml:space="preserve">To keep things running smoothly and fairly, the Swift-Load loading bay gives priority to trucks on a strict first-come-first-served basis. The whole process is mathematically modeled as a First-In-First-Out (FIFO) Queue. In essence, a queue is a linear data structure that allows two main operations: enqueue which adds an element to </w:t>
-      </w:r>
-      <w:r>
-        <w:lastRenderedPageBreak/>
-        <w:t>the rear and dequeue which removes an element from the front. Unlike a stack that accesses the most recently added element first, a queue will always process elements in the exact order in which they arrived, thus preventing a situation where a truck could be left waiting indefinitely while newer arrivals are processed first.</w:t>
+        <w:t>To keep things running smoothly and fairly, the Swift-Load loading bay gives priority to trucks on a strict first-come-first-served basis. The whole process is mathematically modeled as a First-In-First-Out (FIFO) Queue. In essence, a queue is a linear data structure that allows two main operations: enqueue which adds an element to the rear and dequeue which removes an element from the front. Unlike a stack that accesses the most recently added element first, a queue will always process elements in the exact order in which they arrived, thus preventing a situation where a truck could be left waiting indefinitely while newer arrivals are processed first.</w:t>
       </w:r>
     </w:p>
     <w:p>
@@ -9158,6 +9756,7 @@
               <w:rPr>
                 <w:rFonts w:ascii="Times New Roman" w:hAnsi="Times New Roman" w:cs="Times New Roman"/>
               </w:rPr>
+              <w:lastRenderedPageBreak/>
               <w:t>2</w:t>
             </w:r>
           </w:p>
@@ -10005,6 +10604,7 @@
       </w:pPr>
       <w:bookmarkStart w:id="3" w:name="_Toc228974715"/>
       <w:r>
+        <w:lastRenderedPageBreak/>
         <w:t xml:space="preserve">M2: Sorting Comparison (Bubble Sort vs </w:t>
       </w:r>
       <w:proofErr w:type="spellStart"/>
@@ -10092,7 +10692,6 @@
           <w:b/>
           <w:bCs/>
         </w:rPr>
-        <w:lastRenderedPageBreak/>
         <w:t>Bubble Sort Algorithm:</w:t>
       </w:r>
     </w:p>
@@ -10361,13 +10960,20 @@
           <w:sz w:val="18"/>
         </w:rPr>
         <w:br/>
-        <w:t xml:space="preserve">    }</w:t>
       </w:r>
       <w:r>
         <w:rPr>
           <w:rFonts w:ascii="Consolas" w:hAnsi="Consolas"/>
           <w:sz w:val="18"/>
         </w:rPr>
+        <w:lastRenderedPageBreak/>
+        <w:t xml:space="preserve">    }</w:t>
+      </w:r>
+      <w:r>
+        <w:rPr>
+          <w:rFonts w:ascii="Consolas" w:hAnsi="Consolas"/>
+          <w:sz w:val="18"/>
+        </w:rPr>
         <w:br/>
         <w:t>}</w:t>
       </w:r>
@@ -10535,13 +11141,6 @@
           <w:sz w:val="18"/>
         </w:rPr>
         <w:br/>
-      </w:r>
-      <w:r>
-        <w:rPr>
-          <w:rFonts w:ascii="Consolas" w:hAnsi="Consolas"/>
-          <w:sz w:val="18"/>
-        </w:rPr>
-        <w:lastRenderedPageBreak/>
         <w:t xml:space="preserve">        </w:t>
       </w:r>
       <w:proofErr w:type="spellStart"/>
@@ -11014,7 +11613,14 @@
               <w:rPr>
                 <w:rFonts w:ascii="Times New Roman" w:hAnsi="Times New Roman" w:cs="Times New Roman"/>
               </w:rPr>
-              <w:t xml:space="preserve"> worst case occurs with already-sorted input</w:t>
+              <w:t xml:space="preserve"> worst case occurs with </w:t>
+            </w:r>
+            <w:r>
+              <w:rPr>
+                <w:rFonts w:ascii="Times New Roman" w:hAnsi="Times New Roman" w:cs="Times New Roman"/>
+              </w:rPr>
+              <w:lastRenderedPageBreak/>
+              <w:t>already-sorted input</w:t>
             </w:r>
           </w:p>
         </w:tc>
@@ -11034,6 +11640,7 @@
               <w:rPr>
                 <w:rFonts w:ascii="Times New Roman" w:hAnsi="Times New Roman" w:cs="Times New Roman"/>
               </w:rPr>
+              <w:lastRenderedPageBreak/>
               <w:t>Comparisons (12 items)</w:t>
             </w:r>
           </w:p>
@@ -11518,14 +12125,7 @@
               <w:rPr>
                 <w:rFonts w:ascii="Times New Roman" w:hAnsi="Times New Roman" w:cs="Times New Roman"/>
               </w:rPr>
-              <w:t xml:space="preserve">Bubble Sort has only 2 nested </w:t>
-            </w:r>
-            <w:r>
-              <w:rPr>
-                <w:rFonts w:ascii="Times New Roman" w:hAnsi="Times New Roman" w:cs="Times New Roman"/>
-              </w:rPr>
-              <w:lastRenderedPageBreak/>
-              <w:t>loops, easier to debug</w:t>
+              <w:t>Bubble Sort has only 2 nested loops, easier to debug</w:t>
             </w:r>
           </w:p>
         </w:tc>
@@ -11541,7 +12141,6 @@
         <w:rPr>
           <w:rFonts w:ascii="Times New Roman" w:hAnsi="Times New Roman" w:cs="Times New Roman"/>
         </w:rPr>
-        <w:lastRenderedPageBreak/>
         <w:t xml:space="preserve">Table 3: Comprehensive Bubble Sort vs </w:t>
       </w:r>
       <w:proofErr w:type="spellStart"/>
@@ -11631,6 +12230,7 @@
         <w:pStyle w:val="SBSFormat"/>
       </w:pPr>
       <w:r>
+        <w:lastRenderedPageBreak/>
         <w:t>Encapsulation is among the four main principles of Object-Oriented Programming, together with inheritance, polymorphism, and abstraction. It is the concept of packaging data (attributes) and functions that operate on the data together into one unit (class), while also limiting the direct access to certain components of the object. In the Goods abstract data type (ADT), all three attributes (name type weight) are made private in C++, so they can neither be accessed nor altered directly from outside the class. All the work has to be done via the public methods (getters and setters) that have been checked and validated. This is an essential measure for maintaining security and integrity in the logistics system.</w:t>
       </w:r>
     </w:p>
@@ -11677,11 +12277,7 @@
       </w:r>
       <w:proofErr w:type="spellEnd"/>
       <w:r>
-        <w:t xml:space="preserve"> &lt; 0, throw exception) is always carried out before the internal state actually changes. This way, there is a single validation </w:t>
-      </w:r>
-      <w:r>
-        <w:lastRenderedPageBreak/>
-        <w:t>checkpoint that safeguards the entire system against incorrect data, no matter which module makes the change.</w:t>
+        <w:t xml:space="preserve"> &lt; 0, throw exception) is always carried out before the internal state actually changes. This way, there is a single validation checkpoint that safeguards the entire system against incorrect data, no matter which module makes the change.</w:t>
       </w:r>
     </w:p>
     <w:p>
@@ -11758,7 +12354,11 @@
         <w:ind w:firstLine="0"/>
       </w:pPr>
       <w:r>
-        <w:t>Encapsulation is a way of implementing software that reduces the dependence of one component on another, simply by hiding the inner details from the users. The truck-loading software is not concerned about what type of variable weight is - double, float, or integer - internally. Such a modular architecture also assures that any errors in the Goods class stay contained there and would not cause the routing or billing modules to become corrupted. This sealed environment therefore helps a lot in reducing the time taken for debugging as well as the overall cost of maintenance throughout the software lifecycle.</w:t>
+        <w:t xml:space="preserve">Encapsulation is a way of implementing software that reduces the dependence of one component on another, simply by hiding the inner details from the users. The truck-loading software is not concerned about what type of variable weight is - double, float, or integer - internally. Such a modular architecture also assures that any errors in the Goods class stay </w:t>
+      </w:r>
+      <w:r>
+        <w:lastRenderedPageBreak/>
+        <w:t>contained there and would not cause the routing or billing modules to become corrupted. This sealed environment therefore helps a lot in reducing the time taken for debugging as well as the overall cost of maintenance throughout the software lifecycle.</w:t>
       </w:r>
     </w:p>
     <w:p>
@@ -11803,11 +12403,7 @@
       </w:r>
       <w:proofErr w:type="gramEnd"/>
       <w:r>
-        <w:t xml:space="preserve"> the code is not able to restrict direct access to individual struct members (g-&gt;weight = -500), cannot </w:t>
-      </w:r>
-      <w:r>
-        <w:lastRenderedPageBreak/>
-        <w:t>package the validation logic with the data it is supposed to preserve, and does not have a formal linkage between the struct and its associated functions.</w:t>
+        <w:t xml:space="preserve"> the code is not able to restrict direct access to individual struct members (g-&gt;weight = -500), cannot package the validation logic with the data it is supposed to preserve, and does not have a formal linkage between the struct and its associated functions.</w:t>
       </w:r>
     </w:p>
     <w:p>
@@ -11863,7 +12459,11 @@
       </w:r>
       <w:proofErr w:type="spellEnd"/>
       <w:r>
-        <w:t>, and display. The C++ class implementation mirrors this formal specification exactly into language-level constructs: private member variables, as the encapsulated data, publicly accessible methods, as the allowable operations constructors to formalize the initialization, and exception handling, to enforce the axioms. The C++ class IS the ADT, implemented in executable code. This direct correspondence is evidence that Object-Oriented Programming is not a separate invention but the natural and inevitable formalization of imperative ADT principles at the programming language level, and it is compiler-enforced guarantees that replace what was previously only a design convention.</w:t>
+        <w:t xml:space="preserve">, and display. The C++ class implementation mirrors this formal specification exactly into language-level constructs: private member variables, as the encapsulated data, publicly accessible methods, as the allowable operations constructors to formalize the initialization, </w:t>
+      </w:r>
+      <w:r>
+        <w:lastRenderedPageBreak/>
+        <w:t>and exception handling, to enforce the axioms. The C++ class IS the ADT, implemented in executable code. This direct correspondence is evidence that Object-Oriented Programming is not a separate invention but the natural and inevitable formalization of imperative ADT principles at the programming language level, and it is compiler-enforced guarantees that replace what was previously only a design convention.</w:t>
       </w:r>
     </w:p>
     <w:p>
@@ -11881,11 +12481,7 @@
         <w:pStyle w:val="SBSFormat"/>
       </w:pPr>
       <w:r>
-        <w:t xml:space="preserve">Task focuses on the theoretical and analytical dimensions of resource management, process control, and routing optimization in the Swift-Load Logistics system. Function execution is managed via stack-based process control. Stack ADT is formally specified in imperative notation. We conduct analysis of different routing algorithms, and finally, </w:t>
-      </w:r>
-      <w:r>
-        <w:lastRenderedPageBreak/>
-        <w:t>through asymptotic analysis and empirical measurement, we determine which of these algorithms is most effective.</w:t>
+        <w:t>Task focuses on the theoretical and analytical dimensions of resource management, process control, and routing optimization in the Swift-Load Logistics system. Function execution is managed via stack-based process control. Stack ADT is formally specified in imperative notation. We conduct analysis of different routing algorithms, and finally, through asymptotic analysis and empirical measurement, we determine which of these algorithms is most effective.</w:t>
       </w:r>
     </w:p>
     <w:p>
@@ -11925,7 +12521,11 @@
         <w:pStyle w:val="SBSFormat"/>
       </w:pPr>
       <w:r>
-        <w:t>There are many ways for computer programs to manage their function executions. One of those methods is through use of a Call Stack. The Call Stack has two main operations; they are push and pop. When a new function is called, a new stack frame is created for this function and is then placed onto the top of the Call Stack. Each stack frame contains four pieces of information about the current function being executed by the CPU. They are: (1) the local variables associated with each function, (2) all parameters passed to a function when it was called, (3) the return address to determine where execution of the program should resume once a function completes execution, and (4) any registers that were used by the CPU prior to calling a particular function that need to be restored so that execution of another function can occur. Once the execution of a function has completed, the top stack frame of the Call Stack is removed (pop operation), and all information in that stack frame is destroyed. The Call Stack now looks like it did before that function was called and execution resumes at the point where it left off.</w:t>
+        <w:t xml:space="preserve">There are many ways for computer programs to manage their function executions. One of those methods is through use of a Call Stack. The Call Stack has two main operations; they are push and pop. When a new function is called, a new stack frame is created for this function and is then placed onto the top of the Call Stack. Each stack frame contains four pieces of information about the current function being executed by the CPU. </w:t>
+      </w:r>
+      <w:r>
+        <w:lastRenderedPageBreak/>
+        <w:t>They are: (1) the local variables associated with each function, (2) all parameters passed to a function when it was called, (3) the return address to determine where execution of the program should resume once a function completes execution, and (4) any registers that were used by the CPU prior to calling a particular function that need to be restored so that execution of another function can occur. Once the execution of a function has completed, the top stack frame of the Call Stack is removed (pop operation), and all information in that stack frame is destroyed. The Call Stack now looks like it did before that function was called and execution resumes at the point where it left off.</w:t>
       </w:r>
     </w:p>
     <w:p>
@@ -12073,11 +12673,7 @@
             </w:r>
             <w:proofErr w:type="gramEnd"/>
             <w:r>
-              <w:t xml:space="preserve">), a </w:t>
-            </w:r>
-            <w:r>
-              <w:lastRenderedPageBreak/>
-              <w:t>new frame is pushed</w:t>
+              <w:t>), a new frame is pushed</w:t>
             </w:r>
           </w:p>
         </w:tc>
@@ -12090,7 +12686,6 @@
           <w:p>
             <w:proofErr w:type="gramStart"/>
             <w:r>
-              <w:lastRenderedPageBreak/>
               <w:t>pop(</w:t>
             </w:r>
             <w:proofErr w:type="gramEnd"/>
@@ -12382,6 +12977,7 @@
           </w:tcPr>
           <w:p>
             <w:r>
+              <w:lastRenderedPageBreak/>
               <w:t>TOP →</w:t>
             </w:r>
           </w:p>
@@ -12737,7 +13333,6 @@
           <w:rFonts w:ascii="Consolas" w:hAnsi="Consolas"/>
           <w:sz w:val="18"/>
         </w:rPr>
-        <w:lastRenderedPageBreak/>
         <w:t>cout</w:t>
       </w:r>
       <w:proofErr w:type="spellEnd"/>
@@ -12958,6 +13553,7 @@
       </w:pPr>
       <w:bookmarkStart w:id="8" w:name="_Toc228974720"/>
       <w:r>
+        <w:lastRenderedPageBreak/>
         <w:t>P3: Formal Specification for a Software Stack (Imperative Definition)</w:t>
       </w:r>
       <w:bookmarkEnd w:id="8"/>
@@ -13176,11 +13772,7 @@
             <w:proofErr w:type="spellEnd"/>
             <w:proofErr w:type="gramEnd"/>
             <w:r>
-              <w:t xml:space="preserve"> + 1. </w:t>
-            </w:r>
-            <w:r>
-              <w:lastRenderedPageBreak/>
-              <w:t>All previous elements unchanged.</w:t>
+              <w:t xml:space="preserve"> + 1. All previous elements unchanged.</w:t>
             </w:r>
           </w:p>
         </w:tc>
@@ -13193,7 +13785,6 @@
           <w:p>
             <w:proofErr w:type="gramStart"/>
             <w:r>
-              <w:lastRenderedPageBreak/>
               <w:t>pop(</w:t>
             </w:r>
             <w:proofErr w:type="gramEnd"/>
@@ -13445,6 +14036,7 @@
     </w:tbl>
     <w:p>
       <w:r>
+        <w:lastRenderedPageBreak/>
         <w:t>Table 5: Formal Stack Specification Using Imperative Definition</w:t>
       </w:r>
     </w:p>
@@ -13506,7 +14098,6 @@
       </w:pPr>
       <w:proofErr w:type="spellStart"/>
       <w:r>
-        <w:lastRenderedPageBreak/>
         <w:t>Edsg</w:t>
       </w:r>
       <w:r>
@@ -13545,7 +14136,11 @@
         <w:pStyle w:val="SBSFormat"/>
       </w:pPr>
       <w:r>
-        <w:t>The A* (A-Star) algorithm, named after its three authors Hart, Nilsson and Raphael, dates back to 1968. It is a Dijkstra's algorithm plus a heuristic function h(n) that predicts the remaining cost from node n to the goal. Its evaluation function is f(n) = g(n) +h(n), where g(n) is the actual cost from the source and h(n) is the heuristic estimation. In route finding, the most commonly used heuristics are the Euclidean distance (</w:t>
+        <w:t xml:space="preserve">The A* (A-Star) algorithm, named after its three authors Hart, Nilsson and Raphael, dates back to 1968. It is a Dijkstra's algorithm plus a heuristic function h(n) that predicts the remaining cost from node n to the goal. Its evaluation function is f(n) = g(n) +h(n), where g(n) is the actual cost from the source and h(n) is the heuristic estimation. In route </w:t>
+      </w:r>
+      <w:r>
+        <w:lastRenderedPageBreak/>
+        <w:t>finding, the most commonly used heuristics are the Euclidean distance (</w:t>
       </w:r>
       <w:proofErr w:type="spellStart"/>
       <w:r>
@@ -13813,7 +14408,6 @@
           </w:tcPr>
           <w:p>
             <w:r>
-              <w:lastRenderedPageBreak/>
               <w:t>Best Use Case</w:t>
             </w:r>
           </w:p>
@@ -13907,6 +14501,7 @@
         <w:pStyle w:val="SBSFormat"/>
       </w:pPr>
       <w:r>
+        <w:lastRenderedPageBreak/>
         <w:t>Asymptotic analysis via Big O notation offers a mathematical framework independent of hardware, which can be used to assess how good an algorithm is. Big O characterizes the highest limit of an algorithm's increasing rate of work as the size of input N goes to infinity. It is a technique to neglect constant factors and lower order terms in order to expose the basic behavior of an algorithm as N increases. In this way, engineers are able to compare algorithms on an equal footing without considering the difference in the facilities on which their performances have been measured, such as a modern server versus a truck embedded computer.</w:t>
       </w:r>
     </w:p>
@@ -13942,7 +14537,6 @@
                 <w:b/>
                 <w:color w:val="FFFFFF"/>
               </w:rPr>
-              <w:lastRenderedPageBreak/>
               <w:t>Algorithm</w:t>
             </w:r>
           </w:p>
@@ -14237,7 +14831,11 @@
         <w:pStyle w:val="SBSFormat"/>
       </w:pPr>
       <w:r>
-        <w:t>Algorithm efficiency is evaluated along two complementary aspects: time complexity (duration of execution) and space complexity (amount of memory used). Both aspects matter a lot to the Swift-Load system, where the cargo processing needs to be very fast to allow real-time operations and memory-efficient to work on truck computers.</w:t>
+        <w:t xml:space="preserve">Algorithm efficiency is evaluated along two complementary aspects: time complexity (duration of execution) and space complexity (amount of memory used). Both </w:t>
+      </w:r>
+      <w:r>
+        <w:lastRenderedPageBreak/>
+        <w:t>aspects matter a lot to the Swift-Load system, where the cargo processing needs to be very fast to allow real-time operations and memory-efficient to work on truck computers.</w:t>
       </w:r>
     </w:p>
     <w:p>
@@ -14439,37 +15037,30 @@
           <w:sz w:val="18"/>
         </w:rPr>
         <w:br/>
+        <w:t>// Results: Bubble Sort: 66 comparisons, 34 swaps</w:t>
       </w:r>
       <w:r>
         <w:rPr>
           <w:rFonts w:ascii="Consolas" w:hAnsi="Consolas"/>
           <w:sz w:val="18"/>
         </w:rPr>
-        <w:lastRenderedPageBreak/>
-        <w:t>// Results: Bubble Sort: 66 comparisons, 34 swaps</w:t>
-      </w:r>
+        <w:br/>
+        <w:t xml:space="preserve">//          </w:t>
+      </w:r>
+      <w:proofErr w:type="spellStart"/>
       <w:r>
         <w:rPr>
           <w:rFonts w:ascii="Consolas" w:hAnsi="Consolas"/>
           <w:sz w:val="18"/>
         </w:rPr>
-        <w:br/>
-        <w:t xml:space="preserve">//          </w:t>
-      </w:r>
-      <w:proofErr w:type="spellStart"/>
+        <w:t>QuickSort</w:t>
+      </w:r>
+      <w:proofErr w:type="spellEnd"/>
       <w:r>
         <w:rPr>
           <w:rFonts w:ascii="Consolas" w:hAnsi="Consolas"/>
           <w:sz w:val="18"/>
         </w:rPr>
-        <w:t>QuickSort</w:t>
-      </w:r>
-      <w:proofErr w:type="spellEnd"/>
-      <w:r>
-        <w:rPr>
-          <w:rFonts w:ascii="Consolas" w:hAnsi="Consolas"/>
-          <w:sz w:val="18"/>
-        </w:rPr>
         <w:t>:   34 comparisons, 23 swaps</w:t>
       </w:r>
     </w:p>
@@ -14562,6 +15153,7 @@
       </w:pPr>
       <w:bookmarkStart w:id="12" w:name="_Toc228974724"/>
       <w:r>
+        <w:lastRenderedPageBreak/>
         <w:t>M5: Trade-off Interpretation in ADT Specification</w:t>
       </w:r>
       <w:bookmarkEnd w:id="12"/>
@@ -14684,7 +15276,6 @@
           </w:tcPr>
           <w:p>
             <w:r>
-              <w:lastRenderedPageBreak/>
               <w:t>Hash Table</w:t>
             </w:r>
           </w:p>
@@ -14817,7 +15408,11 @@
           </w:tcPr>
           <w:p>
             <w:r>
-              <w:t>Most memory-efficient per node but search time is linear. Unacceptable for real-time package tracking with thousands of items.</w:t>
+              <w:t xml:space="preserve">Most memory-efficient per node but search time is linear. Unacceptable for real-time package tracking </w:t>
+            </w:r>
+            <w:r>
+              <w:lastRenderedPageBreak/>
+              <w:t>with thousands of items.</w:t>
             </w:r>
           </w:p>
         </w:tc>
@@ -14825,6 +15420,7 @@
     </w:tbl>
     <w:p>
       <w:r>
+        <w:lastRenderedPageBreak/>
         <w:t>Table 8: Space-Time Trade-off Comparison for Inventory Management</w:t>
       </w:r>
     </w:p>
@@ -14862,7 +15458,6 @@
       </w:pPr>
       <w:bookmarkStart w:id="13" w:name="_Toc228974725"/>
       <w:r>
-        <w:lastRenderedPageBreak/>
         <w:t>Task 3: Implementation and Technical Critique</w:t>
       </w:r>
       <w:bookmarkEnd w:id="13"/>
@@ -14899,7 +15494,11 @@
       </w:r>
       <w:proofErr w:type="spellEnd"/>
       <w:r>
-        <w:t xml:space="preserve"> and Evgenii Landis, 1962) is a self-balancing Binary Search Tree (BST) which enforces a particular balance rule very strictly: at each node of the tree, the difference in heights of the left and right subtrees (balance factor) should be, in absolute value, no more than 1. This condition ensures that the height of the tree is never more than 1.44 * log2(N), and thus insertion, deletion, and search operations can be performed in </w:t>
+        <w:t xml:space="preserve"> and Evgenii Landis, 1962) is a self-balancing Binary Search Tree (BST) which enforces a particular balance rule very strictly: at each node of the tree, the difference in heights of the left and right subtrees </w:t>
+      </w:r>
+      <w:r>
+        <w:lastRenderedPageBreak/>
+        <w:t xml:space="preserve">(balance factor) should be, in absolute value, no more than 1. This condition ensures that the height of the tree is never more than 1.44 * log2(N), and thus insertion, deletion, and search operations can be performed in </w:t>
       </w:r>
       <w:proofErr w:type="gramStart"/>
       <w:r>
@@ -14948,11 +15547,7 @@
         <w:pStyle w:val="SBSFormat"/>
       </w:pPr>
       <w:r>
-        <w:t xml:space="preserve">The insertion operation causes the tree to update the balance factor (BF = height(left) - height(right)) for all the nodes that are on the path from the newly inserted node back to </w:t>
-      </w:r>
-      <w:r>
-        <w:lastRenderedPageBreak/>
-        <w:t>the root. In case the balance factor of a node falls out of the interval [-1, +1], rotations are carried out to bring it back to balance. In fact, there are only four situations:</w:t>
+        <w:t>The insertion operation causes the tree to update the balance factor (BF = height(left) - height(right)) for all the nodes that are on the path from the newly inserted node back to the root. In case the balance factor of a node falls out of the interval [-1, +1], rotations are carried out to bring it back to balance. In fact, there are only four situations:</w:t>
       </w:r>
     </w:p>
     <w:tbl>
@@ -15444,20 +16039,13 @@
           <w:sz w:val="18"/>
         </w:rPr>
         <w:br/>
+        <w:t xml:space="preserve">      R---- Tablet (h=2, bf=1)</w:t>
       </w:r>
       <w:r>
         <w:rPr>
           <w:rFonts w:ascii="Consolas" w:hAnsi="Consolas"/>
           <w:sz w:val="18"/>
         </w:rPr>
-        <w:lastRenderedPageBreak/>
-        <w:t xml:space="preserve">      R---- Tablet (h=2, bf=1)</w:t>
-      </w:r>
-      <w:r>
-        <w:rPr>
-          <w:rFonts w:ascii="Consolas" w:hAnsi="Consolas"/>
-          <w:sz w:val="18"/>
-        </w:rPr>
         <w:br/>
         <w:t xml:space="preserve">            L---- Printer (h=1, bf=0)</w:t>
       </w:r>
@@ -15490,6 +16078,7 @@
       </w:pPr>
       <w:bookmarkStart w:id="15" w:name="_Toc228974727"/>
       <w:r>
+        <w:lastRenderedPageBreak/>
         <w:t>P5: Robustness and Testing Report</w:t>
       </w:r>
       <w:bookmarkEnd w:id="15"/>
@@ -15533,11 +16122,7 @@
       </w:r>
       <w:proofErr w:type="spellEnd"/>
       <w:r>
-        <w:t xml:space="preserve"> is done </w:t>
-      </w:r>
-      <w:r>
-        <w:lastRenderedPageBreak/>
-        <w:t>if the condition is violated. This means that it is impossible to generate corrupted objects.</w:t>
+        <w:t xml:space="preserve"> is done if the condition is violated. This means that it is impossible to generate corrupted objects.</w:t>
       </w:r>
     </w:p>
     <w:p>
@@ -15802,6 +16387,13 @@
           <w:sz w:val="18"/>
         </w:rPr>
         <w:br/>
+      </w:r>
+      <w:r>
+        <w:rPr>
+          <w:rFonts w:ascii="Consolas" w:hAnsi="Consolas"/>
+          <w:sz w:val="18"/>
+        </w:rPr>
+        <w:lastRenderedPageBreak/>
         <w:t xml:space="preserve">        throw </w:t>
       </w:r>
       <w:proofErr w:type="spellStart"/>
@@ -16107,7 +16699,6 @@
           </w:tcPr>
           <w:p>
             <w:r>
-              <w:lastRenderedPageBreak/>
               <w:t>T2</w:t>
             </w:r>
           </w:p>
@@ -16456,6 +17047,7 @@
     </w:tbl>
     <w:p>
       <w:r>
+        <w:lastRenderedPageBreak/>
         <w:t>Table 10: Complete Robustness Test Results (8/8 Tests Passed)</w:t>
       </w:r>
     </w:p>
@@ -16509,7 +17101,6 @@
                 <w:b/>
                 <w:color w:val="FFFFFF"/>
               </w:rPr>
-              <w:lastRenderedPageBreak/>
               <w:t>Search Key</w:t>
             </w:r>
           </w:p>
@@ -17057,6 +17648,7 @@
           </w:tcPr>
           <w:p>
             <w:r>
+              <w:lastRenderedPageBreak/>
               <w:t>1,000,000,000</w:t>
             </w:r>
           </w:p>
@@ -17337,7 +17929,6 @@
           </w:tcPr>
           <w:p>
             <w:r>
-              <w:lastRenderedPageBreak/>
               <w:t>Space per Element</w:t>
             </w:r>
           </w:p>
@@ -17448,7 +18039,11 @@
         <w:pStyle w:val="SBSFormat"/>
       </w:pPr>
       <w:r>
-        <w:t>Implementation independence is one of the key software engineering principles which essentially separates the behavioral specification of a data structure at an abstract level (WHAT it does) from its concrete realization at the code level (HOW it does it). One way to achieve this separation is through interfaces that not only define method signatures but also specify parameter types, return types, and behavioral contracts without disclosure of internal implementation details. For the Swift-Load Logistics platform, following this principle yields three main benefits:</w:t>
+        <w:t xml:space="preserve">Implementation independence is one of the key software engineering principles which essentially separates the behavioral specification of a data structure at an abstract </w:t>
+      </w:r>
+      <w:r>
+        <w:lastRenderedPageBreak/>
+        <w:t>level (WHAT it does) from its concrete realization at the code level (HOW it does it). One way to achieve this separation is through interfaces that not only define method signatures but also specify parameter types, return types, and behavioral contracts without disclosure of internal implementation details. For the Swift-Load Logistics platform, following this principle yields three main benefits:</w:t>
       </w:r>
     </w:p>
     <w:p>
@@ -17465,11 +18060,7 @@
         <w:pStyle w:val="SBSFormat"/>
       </w:pPr>
       <w:r>
-        <w:t xml:space="preserve">As the Goods ADT and AVL Tree only expose three abstract interface methods (insert search display) and do not reveal their C++ implementation details, it is possible to port the entire system architecture to different programming languages and platforms </w:t>
-      </w:r>
-      <w:r>
-        <w:lastRenderedPageBreak/>
-        <w:t>without redesigning the core logic. Tables 1 and 5 of the formal specification</w:t>
+        <w:t>As the Goods ADT and AVL Tree only expose three abstract interface methods (insert search display) and do not reveal their C++ implementation details, it is possible to port the entire system architecture to different programming languages and platforms without redesigning the core logic. Tables 1 and 5 of the formal specification</w:t>
       </w:r>
       <w:r>
         <w:t xml:space="preserve"> </w:t>
@@ -17554,7 +18145,11 @@
       </w:r>
       <w:proofErr w:type="gramEnd"/>
       <w:r>
-        <w:t>), which are the same, no matter the underlying tree type, no changes are required in other modules. The truck-loading module, billing system, delivery dashboard, and reporting engine all continue working without any changes and without recompilation, significantly lowering regression risk and the cost of testing.</w:t>
+        <w:t xml:space="preserve">), which are the same, no matter the underlying tree type, no changes are required in other modules. The truck-loading module, billing system, delivery dashboard, and reporting engine all continue </w:t>
+      </w:r>
+      <w:r>
+        <w:lastRenderedPageBreak/>
+        <w:t>working without any changes and without recompilation, significantly lowering regression risk and the cost of testing.</w:t>
       </w:r>
     </w:p>
     <w:p>
@@ -17579,11 +18174,7 @@
       </w:r>
       <w:proofErr w:type="gramEnd"/>
       <w:r>
-        <w:t xml:space="preserve">) function takes a string key and returns a Goods pointer (or null if not found). At the same time, the backend team could be deeply engaged in implementing the complex AVL tree rotation logic without any interference. Both teams rely on the same formal interface contract that is documented in the specification tables. On the day of integration, these components just plug in nicely with </w:t>
-      </w:r>
-      <w:r>
-        <w:lastRenderedPageBreak/>
-        <w:t>each other because both sides have adhered to the agreed-upon interface. According to some industry reports, such a separation of concerns can in fact cut the total development time by 30-40% in case of a team of 5+ developers since it removes the blocking dependencies where one team has to wait for the other's implementation, which results in the latter being able to start their work only after the completion of the former's.</w:t>
+        <w:t>) function takes a string key and returns a Goods pointer (or null if not found). At the same time, the backend team could be deeply engaged in implementing the complex AVL tree rotation logic without any interference. Both teams rely on the same formal interface contract that is documented in the specification tables. On the day of integration, these components just plug in nicely with each other because both sides have adhered to the agreed-upon interface. According to some industry reports, such a separation of concerns can in fact cut the total development time by 30-40% in case of a team of 5+ developers since it removes the blocking dependencies where one team has to wait for the other's implementation, which results in the latter being able to start their work only after the completion of the former's.</w:t>
       </w:r>
     </w:p>
     <w:p>
@@ -34310,12 +34901,14 @@
     <w:pitch w:val="variable"/>
     <w:sig w:usb0="E00006FF" w:usb1="420024FF" w:usb2="02000000" w:usb3="00000000" w:csb0="0000019F" w:csb1="00000000"/>
   </w:font>
-  <w:font w:name="MS Mincho">
+  <w:font w:name="ＭＳ 明朝">
+    <w:altName w:val="MS Mincho"/>
     <w:panose1 w:val="02020609040205080304"/>
     <w:charset w:val="80"/>
-    <w:family w:val="modern"/>
+    <w:family w:val="roman"/>
+    <w:notTrueType/>
     <w:pitch w:val="fixed"/>
-    <w:sig w:usb0="E00002FF" w:usb1="6AC7FDFB" w:usb2="08000012" w:usb3="00000000" w:csb0="0002009F" w:csb1="00000000"/>
+    <w:sig w:usb0="00000001" w:usb1="08070000" w:usb2="00000010" w:usb3="00000000" w:csb0="00020000" w:csb1="00000000"/>
   </w:font>
   <w:font w:name="Myanmar Text">
     <w:panose1 w:val="020B0502040204020203"/>
@@ -34413,6 +35006,7 @@
     <w:rsid w:val="00570430"/>
     <w:rsid w:val="00572892"/>
     <w:rsid w:val="005903D7"/>
+    <w:rsid w:val="00594A7A"/>
     <w:rsid w:val="005D2BE3"/>
     <w:rsid w:val="006242B8"/>
     <w:rsid w:val="00624FE9"/>
@@ -34427,6 +35021,7 @@
     <w:rsid w:val="007D1C7F"/>
     <w:rsid w:val="008A7FD6"/>
     <w:rsid w:val="008C01D9"/>
+    <w:rsid w:val="00972978"/>
     <w:rsid w:val="009C357A"/>
     <w:rsid w:val="009C3AC7"/>
     <w:rsid w:val="00AC066A"/>

</xml_diff>